<commit_message>
Lots of refactoring. Moving from scripts directory to scripts/dev_tools. Other changes as well
</commit_message>
<xml_diff>
--- a/biochar_app/markdown/docx/acknowledgements.docx
+++ b/biochar_app/markdown/docx/acknowledgements.docx
@@ -98,7 +98,10 @@
         </w:numPr>
       </w:pPr>
       <w:r>
-        <w:t>Citizens for Clean Air, Grand Junction</w:t>
+        <w:rPr>
+          <w:color w:val="212121"/>
+        </w:rPr>
+        <w:t>Western Colorado Community Foundation/Dave and Mary Wood Fund</w:t>
       </w:r>
     </w:p>
     <w:p>
@@ -110,7 +113,7 @@
         </w:numPr>
       </w:pPr>
       <w:r>
-        <w:t xml:space="preserve">Ward Labs, Kearney, Nebraska </w:t>
+        <w:t>Citizens for Clean Air, Grand Junction</w:t>
       </w:r>
     </w:p>
     <w:p>
@@ -122,7 +125,7 @@
         </w:numPr>
       </w:pPr>
       <w:r>
-        <w:t>CSU’s Western Colorado Research Center Research Associates James Fry and Bill Szasz as well as Field Technician Charlie Richards</w:t>
+        <w:t xml:space="preserve">Ward Labs, Kearney, Nebraska </w:t>
       </w:r>
     </w:p>
     <w:p>
@@ -134,7 +137,7 @@
         </w:numPr>
       </w:pPr>
       <w:r>
-        <w:t xml:space="preserve">Dr. Gigi Richard who was always supportive of this project. </w:t>
+        <w:t>CSU’s Western Colorado Research Center Research Associates James Fry and Bill Szasz as well as Field Technician Charlie Richards</w:t>
       </w:r>
     </w:p>
     <w:p>
@@ -146,7 +149,7 @@
         </w:numPr>
       </w:pPr>
       <w:r>
-        <w:t>Alex Dunlop and Bill Jaeger at LOR Foundation (LOR)</w:t>
+        <w:t xml:space="preserve">Dr. Gigi Richard who was always supportive of this project. </w:t>
       </w:r>
     </w:p>
     <w:p>
@@ -158,7 +161,7 @@
         </w:numPr>
       </w:pPr>
       <w:r>
-        <w:t xml:space="preserve">Phil Brink and Greg Peterson of Colorado Ag Water Alliance (CAWA) for financially supporting this project </w:t>
+        <w:t>Alex Dunlop and Bill Jaeger at LOR Foundation (LOR)</w:t>
       </w:r>
     </w:p>
     <w:p>
@@ -170,7 +173,7 @@
         </w:numPr>
       </w:pPr>
       <w:r>
-        <w:t>Brenna Mefford of Wilson Water Group, LLC</w:t>
+        <w:t xml:space="preserve">Phil Brink and Greg Peterson of Colorado Ag Water Alliance (CAWA) for financially supporting this project </w:t>
       </w:r>
     </w:p>
     <w:p>
@@ -182,7 +185,7 @@
         </w:numPr>
       </w:pPr>
       <w:r>
-        <w:t xml:space="preserve">Jeff Pieper, CSU Area Extension Specialist for suggesting the use of the SPAD device. Ray Hedgecoke for the use of his skid steer and auger. </w:t>
+        <w:t>Brenna Mefford of Wilson Water Group, LLC</w:t>
       </w:r>
     </w:p>
     <w:p>
@@ -194,13 +197,7 @@
         </w:numPr>
       </w:pPr>
       <w:r>
-        <w:t xml:space="preserve">Bryan Reed, </w:t>
-      </w:r>
-      <w:r>
-        <w:t>former</w:t>
-      </w:r>
-      <w:r>
-        <w:t xml:space="preserve"> Colorado Mesa University (CMU Tech) Agricultural Technical Professor and current Colorado State University WCRC Operations Manager for Agricultural Research for his continued encouragement, discussions, and biochar inoculation experiments for future field applications</w:t>
+        <w:t xml:space="preserve">Jeff Pieper, CSU Area Extension Specialist for suggesting the use of the SPAD device. Ray Hedgecoke for the use of his skid steer and auger. </w:t>
       </w:r>
     </w:p>
     <w:p>
@@ -212,7 +209,13 @@
         </w:numPr>
       </w:pPr>
       <w:r>
-        <w:t>Dr. Ann Hess of CSU’s Graybill Stat Lab for her guidance and recommendations tackling the data</w:t>
+        <w:t xml:space="preserve">Bryan Reed, </w:t>
+      </w:r>
+      <w:r>
+        <w:t>former</w:t>
+      </w:r>
+      <w:r>
+        <w:t xml:space="preserve"> Colorado Mesa University (CMU Tech) Agricultural Technical Professor and current Colorado State University WCRC Operations Manager for Agricultural Research for his continued encouragement, discussions, and biochar inoculation experiments for future field applications</w:t>
       </w:r>
     </w:p>
     <w:p>
@@ -224,7 +227,7 @@
         </w:numPr>
       </w:pPr>
       <w:r>
-        <w:t>The CSU IN-RICHES team, including Dr. Megan Machmuller, Dr. Lexi Firth, Rebecca Even, M.Sc., and Dr. Jim Ippolito of University of Ohio for their collaborative efforts for including this field into their expansive soil health studies as well as their continued advice, expertise and support</w:t>
+        <w:t>Dr. Ann Hess of CSU’s Graybill Stat Lab for her guidance and recommendations tackling the data</w:t>
       </w:r>
     </w:p>
     <w:p>
@@ -236,7 +239,7 @@
         </w:numPr>
       </w:pPr>
       <w:r>
-        <w:t>Dr. Albert Grable, retired USDA Soil Scientist/CSU, for his encouragement and sharing his knowledge</w:t>
+        <w:t>The CSU IN-RICHES team, including Dr. Megan Machmuller, Dr. Lexi Firth, Rebecca Even, M.Sc., and Dr. Jim Ippolito of University of Ohio for their collaborative efforts for including this field into their expansive soil health studies as well as their continued advice, expertise and support</w:t>
       </w:r>
     </w:p>
     <w:p>
@@ -248,7 +251,7 @@
         </w:numPr>
       </w:pPr>
       <w:r>
-        <w:t xml:space="preserve">Mark Shoemaker of DryJect Colorado and his time for his spirit of adventure to try something inherently difficult and extraordinary with his machines. </w:t>
+        <w:t>Dr. Albert Grable, retired USDA Soil Scientist/CSU, for his encouragement and sharing his knowledge</w:t>
       </w:r>
     </w:p>
     <w:p>
@@ -259,9 +262,21 @@
           <w:numId w:val="1"/>
         </w:numPr>
       </w:pPr>
+      <w:r>
+        <w:lastRenderedPageBreak/>
+        <w:t xml:space="preserve">Mark Shoemaker of DryJect Colorado and his time for his spirit of adventure to try something inherently difficult and extraordinary with his machines. </w:t>
+      </w:r>
+    </w:p>
+    <w:p>
+      <w:pPr>
+        <w:pStyle w:val="ListParagraph"/>
+        <w:numPr>
+          <w:ilvl w:val="0"/>
+          <w:numId w:val="1"/>
+        </w:numPr>
+      </w:pPr>
       <w:proofErr w:type="spellStart"/>
       <w:r>
-        <w:lastRenderedPageBreak/>
         <w:t>VGrid</w:t>
       </w:r>
       <w:proofErr w:type="spellEnd"/>

</xml_diff>

<commit_message>
More refactoring and some updated markdown files
</commit_message>
<xml_diff>
--- a/biochar_app/markdown/docx/acknowledgements.docx
+++ b/biochar_app/markdown/docx/acknowledgements.docx
@@ -40,7 +40,32 @@
     </w:p>
     <w:p>
       <w:r>
-        <w:t>CSU provided access to an unused research pasture strip and surplus data gathering equipment (data loggers and solar panels) and important technical expertise in their use. Lobato, Nelson, and then Colorado Mesa University (CMU) student Holly Stanley joined the project in its initial preparation activities in the spring of 2023. All three have remained active on the project.</w:t>
+        <w:t xml:space="preserve">CSU provided access to an unused research pasture strip and surplus data gathering equipment (data loggers and solar panels) and important technical expertise in their use. Lobato, Nelson, and Holly Stanley </w:t>
+      </w:r>
+      <w:r>
+        <w:rPr>
+          <w:color w:val="212121"/>
+        </w:rPr>
+        <w:t>, who began as an intern from Colorado Mesa University</w:t>
+      </w:r>
+      <w:r>
+        <w:rPr>
+          <w:color w:val="212121"/>
+        </w:rPr>
+        <w:t xml:space="preserve"> and after graduation </w:t>
+      </w:r>
+      <w:r>
+        <w:rPr>
+          <w:color w:val="212121"/>
+        </w:rPr>
+        <w:t>continued her work with the team as a Research Associate with</w:t>
+      </w:r>
+      <w:r>
+        <w:rPr>
+          <w:rFonts w:ascii="Aptos" w:hAnsi="Aptos"/>
+          <w:color w:val="212121"/>
+        </w:rPr>
+        <w:t xml:space="preserve"> Matrix Resource Technologies. All three have remained active on the project.</w:t>
       </w:r>
     </w:p>
     <w:p>

</xml_diff>

<commit_message>
More refactoring and some updated markdown files. Also added files from the new scripts/dev_tools directory
</commit_message>
<xml_diff>
--- a/biochar_app/markdown/docx/acknowledgements.docx
+++ b/biochar_app/markdown/docx/acknowledgements.docx
@@ -40,7 +40,7 @@
     </w:p>
     <w:p>
       <w:r>
-        <w:t xml:space="preserve">CSU provided access to an unused research pasture strip and surplus data gathering equipment (data loggers and solar panels) and important technical expertise in their use. Lobato, Nelson, and Holly Stanley </w:t>
+        <w:t>CSU provided access to an unused research pasture strip and surplus data gathering equipment (data loggers and solar panels) and important technical expertise in their use. Lobato, Nelson, and Holly Stanley</w:t>
       </w:r>
       <w:r>
         <w:rPr>
@@ -58,14 +58,7 @@
         <w:rPr>
           <w:color w:val="212121"/>
         </w:rPr>
-        <w:t>continued her work with the team as a Research Associate with</w:t>
-      </w:r>
-      <w:r>
-        <w:rPr>
-          <w:rFonts w:ascii="Aptos" w:hAnsi="Aptos"/>
-          <w:color w:val="212121"/>
-        </w:rPr>
-        <w:t xml:space="preserve"> Matrix Resource Technologies. All three have remained active on the project.</w:t>
+        <w:t>continued her work with the team as a Research Associate with Matrix Resource Technologies. All three have remained active on the project.</w:t>
       </w:r>
     </w:p>
     <w:p>

</xml_diff>